<commit_message>
Clean dataset release: drop PDFs/DIFF, fix stats, slim README.
Remove example raw PDFs and recipe/Diff metadata, drop the B02 helper-only row, document outliers and sensitivity stats, extend usage with alcohol-profile tracking, and simplify the root README layout.

Co-authored-by: Cursor <cursoragent@cursor.com>
</commit_message>
<xml_diff>
--- a/paper/yeast_fermentation_dataset_DataInBrief.docx
+++ b/paper/yeast_fermentation_dataset_DataInBrief.docx
@@ -145,7 +145,7 @@
           <w:i w:val="0"/>
           <w:sz w:val="22"/>
         </w:rPr>
-        <w:t>This data article presents an industrial baker’s-yeast fed-batch fermentation dataset curated for nutrient-addition (primarily reducing-sugar feed-rate) prediction. The primary source materials are batch PDF logs completed by experienced plant operators and technicians during production, based on on-site process measurements and observations. These expert records were digitized into analysis-ready tables, yielding 61 production batches and 1,128 hourly records of process variables including alcohol concentration, biomass (Y30), sugar feed rate, and—for a 10-batch full-process subset—airflow, volume, pH, cell concentration, and growth modulus. All released files are UTF-8 CSV with documented headers. The dataset supports development and benchmarking of machine-learning and deep-learning models for fed-batch nutrient dosing, process monitoring, and transfer learning across fermentation batches. Data are intended for deposition in a public repository under an open license.</w:t>
+        <w:t>This data article presents an industrial baker’s-yeast fed-batch fermentation dataset curated for nutrient-addition (primarily reducing-sugar feed-rate) prediction. The primary source materials are batch PDF logs completed by experienced plant operators and technicians during production, based on on-site process measurements and observations. These expert records were digitized into analysis-ready tables, yielding 61 production batches and 1,127 hourly records of process variables including alcohol concentration, biomass (Y30), sugar feed rate, and—for a 10-batch full-process subset—airflow, volume, pH, cell concentration, and growth modulus. All released files are UTF-8 CSV with documented headers. Original PDF sheets are retained by the data owners and are not redistributed with the public package. The dataset supports development and benchmarking of machine-learning and deep-learning models for fed-batch nutrient dosing, process monitoring, and transfer learning across fermentation batches. Data are intended for deposition in a public repository under an open license.</w:t>
       </w:r>
     </w:p>
     <w:p>
@@ -391,7 +391,7 @@
                 <w:i w:val="0"/>
                 <w:sz w:val="20"/>
               </w:rPr>
-              <w:t>Industrial yeast fermentation facility production records (institution to be specified by data owners before submission). Example original PDF batch logs are archived under dataset/raw_pdfs/.</w:t>
+              <w:t>Industrial yeast fermentation facility production records (institution to be specified by data owners before submission). Original PDF batch logs remain with the data owners and are not part of the public deposit.</w:t>
             </w:r>
           </w:p>
         </w:tc>
@@ -682,7 +682,7 @@
           <w:i w:val="0"/>
           <w:sz w:val="22"/>
         </w:rPr>
-        <w:t>The dataset package consists of primary CSV files, documentation, and example original PDF batch logs. Table 1 summarizes the file inventory. Overview plots used in this article (Figs. 1–4) are manuscript materials and are not included in the public dataset deposit.</w:t>
+        <w:t>The dataset package consists of primary CSV files and documentation. Table 1 summarizes the file inventory. Overview plots used in this article (Figs. 1–4) are manuscript materials and are not included in the public dataset deposit.</w:t>
       </w:r>
     </w:p>
     <w:p>
@@ -873,7 +873,7 @@
                 <w:i w:val="0"/>
                 <w:sz w:val="20"/>
               </w:rPr>
-              <w:t>Stacked hourly records (n = 1,128) across all batches</w:t>
+              <w:t>Stacked hourly records (n = 1,127) across all batches</w:t>
             </w:r>
           </w:p>
         </w:tc>
@@ -945,6 +945,59 @@
                 <w:i w:val="0"/>
                 <w:sz w:val="20"/>
               </w:rPr>
+              <w:t>summary_stats.json</w:t>
+            </w:r>
+          </w:p>
+        </w:tc>
+        <w:tc>
+          <w:tcPr>
+            <w:tcW w:type="dxa" w:w="2880"/>
+          </w:tcPr>
+          <w:p>
+            <w:r/>
+            <w:r>
+              <w:rPr>
+                <w:rFonts w:ascii="Times New Roman" w:hAnsi="Times New Roman" w:eastAsia="Times New Roman"/>
+                <w:b w:val="0"/>
+                <w:i w:val="0"/>
+                <w:sz w:val="20"/>
+              </w:rPr>
+              <w:t>JSON</w:t>
+            </w:r>
+          </w:p>
+        </w:tc>
+        <w:tc>
+          <w:tcPr>
+            <w:tcW w:type="dxa" w:w="2880"/>
+          </w:tcPr>
+          <w:p>
+            <w:r/>
+            <w:r>
+              <w:rPr>
+                <w:rFonts w:ascii="Times New Roman" w:hAnsi="Times New Roman" w:eastAsia="Times New Roman"/>
+                <w:b w:val="0"/>
+                <w:i w:val="0"/>
+                <w:sz w:val="20"/>
+              </w:rPr>
+              <w:t>Machine-readable descriptive statistics and quality flags</w:t>
+            </w:r>
+          </w:p>
+        </w:tc>
+      </w:tr>
+      <w:tr>
+        <w:tc>
+          <w:tcPr>
+            <w:tcW w:type="dxa" w:w="2880"/>
+          </w:tcPr>
+          <w:p>
+            <w:r/>
+            <w:r>
+              <w:rPr>
+                <w:rFonts w:ascii="Times New Roman" w:hAnsi="Times New Roman" w:eastAsia="Times New Roman"/>
+                <w:b w:val="0"/>
+                <w:i w:val="0"/>
+                <w:sz w:val="20"/>
+              </w:rPr>
               <w:t>README.md</w:t>
             </w:r>
           </w:p>
@@ -980,59 +1033,6 @@
                 <w:sz w:val="20"/>
               </w:rPr>
               <w:t>Column definitions, completeness notes, recommended prediction task</w:t>
-            </w:r>
-          </w:p>
-        </w:tc>
-      </w:tr>
-      <w:tr>
-        <w:tc>
-          <w:tcPr>
-            <w:tcW w:type="dxa" w:w="2880"/>
-          </w:tcPr>
-          <w:p>
-            <w:r/>
-            <w:r>
-              <w:rPr>
-                <w:rFonts w:ascii="Times New Roman" w:hAnsi="Times New Roman" w:eastAsia="Times New Roman"/>
-                <w:b w:val="0"/>
-                <w:i w:val="0"/>
-                <w:sz w:val="20"/>
-              </w:rPr>
-              <w:t>raw_pdfs/*.PDF</w:t>
-            </w:r>
-          </w:p>
-        </w:tc>
-        <w:tc>
-          <w:tcPr>
-            <w:tcW w:type="dxa" w:w="2880"/>
-          </w:tcPr>
-          <w:p>
-            <w:r/>
-            <w:r>
-              <w:rPr>
-                <w:rFonts w:ascii="Times New Roman" w:hAnsi="Times New Roman" w:eastAsia="Times New Roman"/>
-                <w:b w:val="0"/>
-                <w:i w:val="0"/>
-                <w:sz w:val="20"/>
-              </w:rPr>
-              <w:t>PDF</w:t>
-            </w:r>
-          </w:p>
-        </w:tc>
-        <w:tc>
-          <w:tcPr>
-            <w:tcW w:type="dxa" w:w="2880"/>
-          </w:tcPr>
-          <w:p>
-            <w:r/>
-            <w:r>
-              <w:rPr>
-                <w:rFonts w:ascii="Times New Roman" w:hAnsi="Times New Roman" w:eastAsia="Times New Roman"/>
-                <w:b w:val="0"/>
-                <w:i w:val="0"/>
-                <w:sz w:val="20"/>
-              </w:rPr>
-              <w:t>Example original expert-completed industrial batch logs (12 files)</w:t>
             </w:r>
           </w:p>
         </w:tc>
@@ -2597,7 +2597,25 @@
           <w:i w:val="0"/>
           <w:sz w:val="22"/>
         </w:rPr>
-        <w:t>. During production, experienced operators and technicians performed process measurements (e.g., airflow, volume, pH, alcohol, cell/biomass-related quantities) and recorded the observed values, together with the sugar feed adjustments made during the run, onto standardized batch sheets archived as PDF files. Representative original PDFs are stored in dataset/raw_pdfs/ (for example, 2291-D(2284).PDF, 2317-D(2303).PDF, 2324-D(2316).PDF, and related lot sheets).</w:t>
+        <w:t xml:space="preserve">. During production, experienced operators and technicians performed process measurements (e.g., airflow, volume, pH, alcohol, cell/biomass-related quantities) and recorded the observed values, together with the sugar feed adjustments made during the run, onto standardized batch sheets archived as PDF files. The original PDFs remain with the data owners for provenance and are </w:t>
+      </w:r>
+      <w:r>
+        <w:rPr>
+          <w:rFonts w:ascii="Times New Roman" w:hAnsi="Times New Roman" w:eastAsia="Times New Roman"/>
+          <w:b/>
+          <w:i w:val="0"/>
+          <w:sz w:val="22"/>
+        </w:rPr>
+        <w:t>not</w:t>
+      </w:r>
+      <w:r>
+        <w:rPr>
+          <w:rFonts w:ascii="Times New Roman" w:hAnsi="Times New Roman" w:eastAsia="Times New Roman"/>
+          <w:b w:val="0"/>
+          <w:i w:val="0"/>
+          <w:sz w:val="22"/>
+        </w:rPr>
+        <w:t xml:space="preserve"> redistributed in the public CSV package.</w:t>
       </w:r>
     </w:p>
     <w:p>
@@ -2850,7 +2868,35 @@
           <w:i w:val="0"/>
           <w:sz w:val="22"/>
         </w:rPr>
+        <w:t>Hourly rows containing only helper fields (no process variables) were removed during packaging (one such row in B02).</w:t>
+      </w:r>
+    </w:p>
+    <w:p>
+      <w:pPr>
+        <w:pStyle w:val="ListNumber"/>
+      </w:pPr>
+      <w:r>
+        <w:rPr>
+          <w:rFonts w:ascii="Times New Roman" w:hAnsi="Times New Roman" w:eastAsia="Times New Roman"/>
+          <w:b w:val="0"/>
+          <w:i w:val="0"/>
+          <w:sz w:val="22"/>
+        </w:rPr>
         <w:t>Batch B05 retains volume values that are approximately an order of magnitude larger than peer batches; this is flagged in batch_metadata.csv notes and treated as a raw recording anomaly.</w:t>
+      </w:r>
+    </w:p>
+    <w:p>
+      <w:pPr>
+        <w:pStyle w:val="ListNumber"/>
+      </w:pPr>
+      <w:r>
+        <w:rPr>
+          <w:rFonts w:ascii="Times New Roman" w:hAnsi="Times New Roman" w:eastAsia="Times New Roman"/>
+          <w:b w:val="0"/>
+          <w:i w:val="0"/>
+          <w:sz w:val="22"/>
+        </w:rPr>
+        <w:t>End-of-batch airflow values &gt; 40,000 m³/h (B04, B09), duplicate lot headers (B10/B11), and sparse early-phase biomass extremes are flagged in metadata / summary_stats.json.</w:t>
       </w:r>
     </w:p>
     <w:p>
@@ -3027,7 +3073,7 @@
                 <w:i w:val="0"/>
                 <w:sz w:val="20"/>
               </w:rPr>
-              <w:t>dataset/raw_pdfs/*.PDF</w:t>
+              <w:t>Source archive (data owners; not redistributed)</w:t>
             </w:r>
           </w:p>
         </w:tc>
@@ -4731,7 +4777,7 @@
           <w:i w:val="0"/>
           <w:sz w:val="22"/>
         </w:rPr>
-        <w:t>Note: As indicated by the volume range in Table 5, volume maxima are dominated by batch B05; users analysing volume should either exclude B05 or apply batch-wise robust scaling.</w:t>
+        <w:t>Notes to Tables 5–6: (i) Volume mean/SD/max in Table 5 are dominated by B05; excluding B05 yields volume mean ≈ 115.4 m³ (SD ≈ 19.9; range 87.7–149.3). (ii) Airflow max = 49992 arises from two end-of-batch outliers (B04, B09); excluding values &gt; 40,000 m³/h yields airflow mean ≈ 16080.6 (max 20892). (iii) Biomass max in Table 6 reflects sparse-batch early-phase extremes (&gt; 60,000 kg) flagged in metadata. (iv) Full-process yield statistics (B01–B10 only; n = 10): mean 39009.2 kg Y30 (SD 352.0).</w:t>
       </w:r>
     </w:p>
     <w:p>
@@ -4910,7 +4956,7 @@
           <w:i w:val="0"/>
           <w:sz w:val="22"/>
         </w:rPr>
-        <w:t xml:space="preserve"> Verified alcohol ≥ 0, pH roughly 3–8, growth modulus near 1–1.6, and sugar feed rates within physically plausible magnitudes for industrial fed-batch operation.</w:t>
+        <w:t xml:space="preserve"> Verified alcohol ≥ 0, pH roughly 3–8, growth modulus near 1–1.6, and sugar feed rates within physically plausible magnitudes for industrial fed-batch operation; flagged volume, airflow, and biomass outliers retained as recorded.</w:t>
       </w:r>
     </w:p>
     <w:p>
@@ -4933,7 +4979,7 @@
           <w:i w:val="0"/>
           <w:sz w:val="22"/>
         </w:rPr>
-        <w:t xml:space="preserve"> Confirmed time_h is unique within each batch_id and monotonically non-decreasing.</w:t>
+        <w:t xml:space="preserve"> Confirmed time_h is unique within each batch_id and monotonically non-decreasing; removed helper-only empty rows.</w:t>
       </w:r>
     </w:p>
     <w:p>
@@ -4947,7 +4993,7 @@
           <w:i w:val="0"/>
           <w:sz w:val="22"/>
         </w:rPr>
-        <w:t>Source traceability:</w:t>
+        <w:t>Provenance:</w:t>
       </w:r>
       <w:r>
         <w:rPr>
@@ -4956,7 +5002,7 @@
           <w:i w:val="0"/>
           <w:sz w:val="22"/>
         </w:rPr>
-        <w:t xml:space="preserve"> Confirmed that example original PDF batch logs are archived alongside the digitized tables.</w:t>
+        <w:t xml:space="preserve"> Digitized values originate from expert-completed industrial PDF batch logs retained by the data owners (not redistributed).</w:t>
       </w:r>
     </w:p>
     <w:p>
@@ -5102,7 +5148,7 @@
                 <w:i w:val="0"/>
                 <w:sz w:val="20"/>
               </w:rPr>
-              <w:t>1,128</w:t>
+              <w:t>1,127</w:t>
             </w:r>
           </w:p>
         </w:tc>
@@ -5157,42 +5203,6 @@
                 <w:i w:val="0"/>
                 <w:sz w:val="20"/>
               </w:rPr>
-              <w:t>Example original PDF logs</w:t>
-            </w:r>
-          </w:p>
-        </w:tc>
-        <w:tc>
-          <w:tcPr>
-            <w:tcW w:type="dxa" w:w="4320"/>
-          </w:tcPr>
-          <w:p>
-            <w:r/>
-            <w:r>
-              <w:rPr>
-                <w:rFonts w:ascii="Times New Roman" w:hAnsi="Times New Roman" w:eastAsia="Times New Roman"/>
-                <w:b w:val="0"/>
-                <w:i w:val="0"/>
-                <w:sz w:val="20"/>
-              </w:rPr>
-              <w:t>12 files in dataset/raw_pdfs/</w:t>
-            </w:r>
-          </w:p>
-        </w:tc>
-      </w:tr>
-      <w:tr>
-        <w:tc>
-          <w:tcPr>
-            <w:tcW w:type="dxa" w:w="4320"/>
-          </w:tcPr>
-          <w:p>
-            <w:r/>
-            <w:r>
-              <w:rPr>
-                <w:rFonts w:ascii="Times New Roman" w:hAnsi="Times New Roman" w:eastAsia="Times New Roman"/>
-                <w:b w:val="0"/>
-                <w:i w:val="0"/>
-                <w:sz w:val="20"/>
-              </w:rPr>
               <w:t>Missing sugar feed rate</w:t>
             </w:r>
           </w:p>
@@ -5210,7 +5220,7 @@
                 <w:i w:val="0"/>
                 <w:sz w:val="20"/>
               </w:rPr>
-              <w:t>62/1,128 (5.5%)</w:t>
+              <w:t>61/1,127 (5.4%); mostly at time_h = 0</w:t>
             </w:r>
           </w:p>
         </w:tc>
@@ -5246,7 +5256,7 @@
                 <w:i w:val="0"/>
                 <w:sz w:val="20"/>
               </w:rPr>
-              <w:t>1/1,128 (0.1%)</w:t>
+              <w:t>0/1,127</w:t>
             </w:r>
           </w:p>
         </w:tc>
@@ -5283,6 +5293,78 @@
                 <w:sz w:val="20"/>
               </w:rPr>
               <w:t>B05</w:t>
+            </w:r>
+          </w:p>
+        </w:tc>
+      </w:tr>
+      <w:tr>
+        <w:tc>
+          <w:tcPr>
+            <w:tcW w:type="dxa" w:w="4320"/>
+          </w:tcPr>
+          <w:p>
+            <w:r/>
+            <w:r>
+              <w:rPr>
+                <w:rFonts w:ascii="Times New Roman" w:hAnsi="Times New Roman" w:eastAsia="Times New Roman"/>
+                <w:b w:val="0"/>
+                <w:i w:val="0"/>
+                <w:sz w:val="20"/>
+              </w:rPr>
+              <w:t>Flagged airflow outliers</w:t>
+            </w:r>
+          </w:p>
+        </w:tc>
+        <w:tc>
+          <w:tcPr>
+            <w:tcW w:type="dxa" w:w="4320"/>
+          </w:tcPr>
+          <w:p>
+            <w:r/>
+            <w:r>
+              <w:rPr>
+                <w:rFonts w:ascii="Times New Roman" w:hAnsi="Times New Roman" w:eastAsia="Times New Roman"/>
+                <w:b w:val="0"/>
+                <w:i w:val="0"/>
+                <w:sz w:val="20"/>
+              </w:rPr>
+              <w:t>B04, B09 (end-of-batch &gt; 40,000 m³/h)</w:t>
+            </w:r>
+          </w:p>
+        </w:tc>
+      </w:tr>
+      <w:tr>
+        <w:tc>
+          <w:tcPr>
+            <w:tcW w:type="dxa" w:w="4320"/>
+          </w:tcPr>
+          <w:p>
+            <w:r/>
+            <w:r>
+              <w:rPr>
+                <w:rFonts w:ascii="Times New Roman" w:hAnsi="Times New Roman" w:eastAsia="Times New Roman"/>
+                <w:b w:val="0"/>
+                <w:i w:val="0"/>
+                <w:sz w:val="20"/>
+              </w:rPr>
+              <w:t>Duplicate lot header</w:t>
+            </w:r>
+          </w:p>
+        </w:tc>
+        <w:tc>
+          <w:tcPr>
+            <w:tcW w:type="dxa" w:w="4320"/>
+          </w:tcPr>
+          <w:p>
+            <w:r/>
+            <w:r>
+              <w:rPr>
+                <w:rFonts w:ascii="Times New Roman" w:hAnsi="Times New Roman" w:eastAsia="Times New Roman"/>
+                <w:b w:val="0"/>
+                <w:i w:val="0"/>
+                <w:sz w:val="20"/>
+              </w:rPr>
+              <w:t>B10/B11 (lot 2616); yield stats use full-process n = 10</w:t>
             </w:r>
           </w:p>
         </w:tc>
@@ -5401,7 +5483,7 @@
           <w:i w:val="0"/>
           <w:sz w:val="22"/>
         </w:rPr>
-        <w:t xml:space="preserve"> Differences between measured alcohol and evaluation_profiles.csv provide a batch-quality indicator; batches with persistently elevated alcohol relative to the profile are candidates for feed-rate oversupply studies.</w:t>
+        <w:t xml:space="preserve"> Differences between measured alcohol and evaluation_profiles.csv provide a batch-quality indicator; batches with persistently elevated alcohol relative to the profile are candidates for feed-rate oversupply studies. The usage script reports alcohol-vs-profile MAE for full-process batches (usage/results/alcohol_profile_mae.json).</w:t>
       </w:r>
     </w:p>
     <w:p>
@@ -5527,7 +5609,7 @@
           <w:i w:val="0"/>
           <w:sz w:val="22"/>
         </w:rPr>
-        <w:t xml:space="preserve"> Values were transferred from expert-completed PDF sheets; handwriting/transcription artefacts may exist and are retained when present.</w:t>
+        <w:t xml:space="preserve"> Values were transferred from expert-completed PDF sheets; handwriting/transcription artefacts may exist and are retained when present. Original PDFs are not part of the public deposit.</w:t>
       </w:r>
     </w:p>
     <w:p>
@@ -5541,7 +5623,7 @@
           <w:i w:val="0"/>
           <w:sz w:val="22"/>
         </w:rPr>
-        <w:t>Incomplete PDF archive in the package:</w:t>
+        <w:t>Recording anomalies retained:</w:t>
       </w:r>
       <w:r>
         <w:rPr>
@@ -5550,7 +5632,7 @@
           <w:i w:val="0"/>
           <w:sz w:val="22"/>
         </w:rPr>
-        <w:t xml:space="preserve"> The repository includes example original PDFs; not every digitized batch PDF is necessarily redistributed with the public package.</w:t>
+        <w:t xml:space="preserve"> Volume values in B05 appear inflated; B04/B09 include extreme end-of-batch airflow; some sparse batches show early-phase biomass extremes (&gt; 60,000 kg). These are flagged but not corrected.</w:t>
       </w:r>
     </w:p>
     <w:p>
@@ -5564,7 +5646,7 @@
           <w:i w:val="0"/>
           <w:sz w:val="22"/>
         </w:rPr>
-        <w:t>Possible recording anomaly:</w:t>
+        <w:t>Duplicate lot headers:</w:t>
       </w:r>
       <w:r>
         <w:rPr>
@@ -5573,7 +5655,7 @@
           <w:i w:val="0"/>
           <w:sz w:val="22"/>
         </w:rPr>
-        <w:t xml:space="preserve"> Volume values in B05 appear inflated relative to peers and should be handled cautiously.</w:t>
+        <w:t xml:space="preserve"> B10 and B11 share lot 2616; B11 is an incomplete sparse sheet and should not be treated as an independent full-information batch.</w:t>
       </w:r>
     </w:p>
     <w:p>
@@ -5737,7 +5819,7 @@
           <w:i w:val="0"/>
           <w:sz w:val="22"/>
         </w:rPr>
-        <w:t>The datasets will be deposited on [figshare/Zenodo] (DOI: [to be completed]). Repository contents include the files listed in Table 1: CSV tables, README.md, and example original PDF batch logs under raw_pdfs/. Manuscript figures (Figs. 1–4) are not part of the dataset deposit.</w:t>
+        <w:t>The datasets will be deposited on [figshare/Zenodo] (DOI: [to be completed]). Repository contents include the files listed in Table 1 (CSV/JSON tables and README.md). Manuscript figures (Figs. 1–4) are not part of the dataset deposit.</w:t>
       </w:r>
     </w:p>
     <w:p>

</xml_diff>

<commit_message>
Add figshare DOI and cite the dataset deposit in the paper.
Record 10.6084/m9.figshare.33201579 in accessibility/data-availability sections, add reference [8], and update README citation text.

Co-authored-by: Cursor <cursoragent@cursor.com>
</commit_message>
<xml_diff>
--- a/paper/yeast_fermentation_dataset_DataInBrief.docx
+++ b/paper/yeast_fermentation_dataset_DataInBrief.docx
@@ -145,7 +145,7 @@
           <w:i w:val="0"/>
           <w:sz w:val="22"/>
         </w:rPr>
-        <w:t>This data article presents an industrial baker’s-yeast fed-batch fermentation dataset curated for nutrient-addition (primarily reducing-sugar feed-rate) prediction. The primary source materials are batch PDF logs completed by experienced plant operators and technicians during production, based on on-site process measurements and observations. These expert records were digitized into analysis-ready tables, yielding 61 production batches and 1,127 hourly records of process variables including alcohol concentration, biomass (Y30), sugar feed rate, and—for a 10-batch full-process subset—airflow, volume, pH, cell concentration, and growth modulus. All released files are UTF-8 CSV with documented headers. Original PDF sheets are retained by the data owners and are not redistributed with the public package. The dataset supports development and benchmarking of machine-learning and deep-learning models for fed-batch nutrient dosing, process monitoring, and transfer learning across fermentation batches. Data are intended for deposition in a public repository under an open license.</w:t>
+        <w:t>This data article presents an industrial baker’s-yeast fed-batch fermentation dataset curated for nutrient-addition (primarily reducing-sugar feed-rate) prediction. The primary source materials are batch PDF logs completed by experienced plant operators and technicians during production, based on on-site process measurements and observations. These expert records were digitized into analysis-ready tables, yielding 61 production batches and 1,127 hourly records of process variables including alcohol concentration, biomass (Y30), sugar feed rate, and—for a 10-batch full-process subset—airflow, volume, pH, cell concentration, and growth modulus. All released files are UTF-8 CSV with documented headers. Original PDF sheets are retained by the data owners and are not redistributed with the public package. The dataset supports development and benchmarking of machine-learning and deep-learning models for fed-batch nutrient dosing, process monitoring, and transfer learning across fermentation batches. The dataset is deposited on figshare under DOI 10.6084/m9.figshare.33201579 [8].</w:t>
       </w:r>
     </w:p>
     <w:p>
@@ -427,7 +427,7 @@
                 <w:i w:val="0"/>
                 <w:sz w:val="20"/>
               </w:rPr>
-              <w:t>Repository name: [figshare/Zenodo — to be completed] Data identification number: [DOI — to be completed] Direct URL to data: [https://doi.org/… — to be completed]</w:t>
+              <w:t>Repository name: figshare Data identification number: 10.6084/m9.figshare.33201579 Direct URL to data: https://doi.org/10.6084/m9.figshare.33201579</w:t>
             </w:r>
           </w:p>
         </w:tc>
@@ -682,7 +682,7 @@
           <w:i w:val="0"/>
           <w:sz w:val="22"/>
         </w:rPr>
-        <w:t>The dataset package consists of primary CSV files and documentation. Table 1 summarizes the file inventory. Overview plots used in this article (Figs. 1–4) are manuscript materials and are not included in the public dataset deposit.</w:t>
+        <w:t>The dataset package consists of primary CSV files and documentation and is publicly available on figshare [8]. Table 1 summarizes the file inventory. Overview plots used in this article (Figs. 1–4) are manuscript materials and are not included in the public dataset deposit.</w:t>
       </w:r>
     </w:p>
     <w:p>
@@ -5683,29 +5683,6 @@
     </w:p>
     <w:p>
       <w:pPr>
-        <w:pStyle w:val="ListBullet"/>
-      </w:pPr>
-      <w:r>
-        <w:rPr>
-          <w:rFonts w:ascii="Times New Roman" w:hAnsi="Times New Roman" w:eastAsia="Times New Roman"/>
-          <w:b/>
-          <w:i w:val="0"/>
-          <w:sz w:val="22"/>
-        </w:rPr>
-        <w:t>Repository DOI pending:</w:t>
-      </w:r>
-      <w:r>
-        <w:rPr>
-          <w:rFonts w:ascii="Times New Roman" w:hAnsi="Times New Roman" w:eastAsia="Times New Roman"/>
-          <w:b w:val="0"/>
-          <w:i w:val="0"/>
-          <w:sz w:val="22"/>
-        </w:rPr>
-        <w:t xml:space="preserve"> Public DOI/URL placeholders must be completed upon deposition.</w:t>
-      </w:r>
-    </w:p>
-    <w:p>
-      <w:pPr>
         <w:pStyle w:val="Heading1"/>
       </w:pPr>
       <w:r>
@@ -5819,7 +5796,7 @@
           <w:i w:val="0"/>
           <w:sz w:val="22"/>
         </w:rPr>
-        <w:t>The datasets will be deposited on [figshare/Zenodo] (DOI: [to be completed]). Repository contents include the files listed in Table 1 (CSV/JSON tables and README.md). Manuscript figures (Figs. 1–4) are not part of the dataset deposit.</w:t>
+        <w:t>The dataset described in this article is available on figshare under DOI 10.6084/m9.figshare.33201579 (https://doi.org/10.6084/m9.figshare.33201579) [8]. Repository contents include the files listed in Table 1 (CSV/JSON tables and README.md). Manuscript figures (Figs. 1–4) are not part of the dataset deposit.</w:t>
       </w:r>
     </w:p>
     <w:p>
@@ -5997,6 +5974,17 @@
           <w:sz w:val="22"/>
         </w:rPr>
         <w:t>[7] Z. Ge, Z. Song, S. X. Ding, B. Huang, Data mining and analytics in the process industry: the role of machine learning, IEEE Access 5 (2017) 20590–20616. https://doi.org/10.1109/ACCESS.2017.2756872.</w:t>
+      </w:r>
+    </w:p>
+    <w:p>
+      <w:r>
+        <w:rPr>
+          <w:rFonts w:ascii="Times New Roman" w:hAnsi="Times New Roman" w:eastAsia="Times New Roman"/>
+          <w:b w:val="0"/>
+          <w:i w:val="0"/>
+          <w:sz w:val="22"/>
+        </w:rPr>
+        <w:t>[8] C. Ren, L. Zhao, L. Kang, Q. Guo, An industrial yeast fed-batch fermentation dataset for nutrient feed-rate prediction, figshare (2026). https://doi.org/10.6084/m9.figshare.33201579.</w:t>
       </w:r>
     </w:p>
     <w:sectPr>

</xml_diff>

<commit_message>
Fix DOI hyperlink rendering in the Data Availability DOCX section.
Use canonical https://doi.org URLs in the manuscript and emit real Word hyperlinks from the markdown converter instead of duplicated plain-text DOI/URL pairs.

Co-authored-by: Cursor <cursoragent@cursor.com>
</commit_message>
<xml_diff>
--- a/paper/yeast_fermentation_dataset_DataInBrief.docx
+++ b/paper/yeast_fermentation_dataset_DataInBrief.docx
@@ -145,7 +145,27 @@
           <w:i w:val="0"/>
           <w:sz w:val="22"/>
         </w:rPr>
-        <w:t>This data article presents an industrial baker’s-yeast fed-batch fermentation dataset curated for nutrient-addition (primarily reducing-sugar feed-rate) prediction. The primary source materials are batch PDF logs completed by experienced plant operators and technicians during production, based on on-site process measurements and observations. These expert records were digitized into analysis-ready tables, yielding 61 production batches and 1,127 hourly records of process variables including alcohol concentration, biomass (Y30), sugar feed rate, and—for a 10-batch full-process subset—airflow, volume, pH, cell concentration, and growth modulus. All released files are UTF-8 CSV with documented headers. Original PDF sheets are retained by the data owners and are not redistributed with the public package. The dataset supports development and benchmarking of machine-learning and deep-learning models for fed-batch nutrient dosing, process monitoring, and transfer learning across fermentation batches. The dataset is deposited on figshare under DOI 10.6084/m9.figshare.33201579 [8].</w:t>
+        <w:t xml:space="preserve">This data article presents an industrial baker’s-yeast fed-batch fermentation dataset curated for nutrient-addition (primarily reducing-sugar feed-rate) prediction. The primary source materials are batch PDF logs completed by experienced plant operators and technicians during production, based on on-site process measurements and observations. These expert records were digitized into analysis-ready tables, yielding 61 production batches and 1,127 hourly records of process variables including alcohol concentration, biomass (Y30), sugar feed rate, and—for a 10-batch full-process subset—airflow, volume, pH, cell concentration, and growth modulus. All released files are UTF-8 CSV with documented headers. Original PDF sheets are retained by the data owners and are not redistributed with the public package. The dataset supports development and benchmarking of machine-learning and deep-learning models for fed-batch nutrient dosing, process monitoring, and transfer learning across fermentation batches. The dataset is deposited on figshare under DOI </w:t>
+      </w:r>
+      <w:hyperlink r:id="rId9">
+        <w:r>
+          <w:rPr>
+            <w:color w:val="0563C1"/>
+            <w:u w:val="single"/>
+            <w:sz w:val="22"/>
+            <w:rFonts w:ascii="Times New Roman" w:hAnsi="Times New Roman" w:eastAsia="Times New Roman"/>
+          </w:rPr>
+          <w:t>https://doi.org/10.6084/m9.figshare.33201579</w:t>
+        </w:r>
+      </w:hyperlink>
+      <w:r>
+        <w:rPr>
+          <w:rFonts w:ascii="Times New Roman" w:hAnsi="Times New Roman" w:eastAsia="Times New Roman"/>
+          <w:b w:val="0"/>
+          <w:i w:val="0"/>
+          <w:sz w:val="22"/>
+        </w:rPr>
+        <w:t xml:space="preserve"> [8].</w:t>
       </w:r>
     </w:p>
     <w:p>
@@ -427,8 +447,19 @@
                 <w:i w:val="0"/>
                 <w:sz w:val="20"/>
               </w:rPr>
-              <w:t>Repository name: figshare Data identification number: 10.6084/m9.figshare.33201579 Direct URL to data: https://doi.org/10.6084/m9.figshare.33201579</w:t>
+              <w:t xml:space="preserve">Repository name: figshare Data identification number: 10.6084/m9.figshare.33201579 Direct URL to data: </w:t>
             </w:r>
+            <w:hyperlink r:id="rId9">
+              <w:r>
+                <w:rPr>
+                  <w:color w:val="0563C1"/>
+                  <w:u w:val="single"/>
+                  <w:sz w:val="20"/>
+                  <w:rFonts w:ascii="Times New Roman" w:hAnsi="Times New Roman" w:eastAsia="Times New Roman"/>
+                </w:rPr>
+                <w:t>https://doi.org/10.6084/m9.figshare.33201579</w:t>
+              </w:r>
+            </w:hyperlink>
           </w:p>
         </w:tc>
       </w:tr>
@@ -2674,7 +2705,7 @@
                     <pic:cNvPicPr/>
                   </pic:nvPicPr>
                   <pic:blipFill>
-                    <a:blip r:embed="rId9"/>
+                    <a:blip r:embed="rId10"/>
                     <a:stretch>
                       <a:fillRect/>
                     </a:stretch>
@@ -2728,7 +2759,7 @@
                     <pic:cNvPicPr/>
                   </pic:nvPicPr>
                   <pic:blipFill>
-                    <a:blip r:embed="rId10"/>
+                    <a:blip r:embed="rId11"/>
                     <a:stretch>
                       <a:fillRect/>
                     </a:stretch>
@@ -4800,7 +4831,7 @@
                     <pic:cNvPicPr/>
                   </pic:nvPicPr>
                   <pic:blipFill>
-                    <a:blip r:embed="rId11"/>
+                    <a:blip r:embed="rId12"/>
                     <a:stretch>
                       <a:fillRect/>
                     </a:stretch>
@@ -4854,7 +4885,7 @@
                     <pic:cNvPicPr/>
                   </pic:nvPicPr>
                   <pic:blipFill>
-                    <a:blip r:embed="rId12"/>
+                    <a:blip r:embed="rId13"/>
                     <a:stretch>
                       <a:fillRect/>
                     </a:stretch>
@@ -5796,7 +5827,27 @@
           <w:i w:val="0"/>
           <w:sz w:val="22"/>
         </w:rPr>
-        <w:t>The dataset described in this article is available on figshare under DOI 10.6084/m9.figshare.33201579 (https://doi.org/10.6084/m9.figshare.33201579) [8]. Repository contents include the files listed in Table 1 (CSV/JSON tables and README.md). Manuscript figures (Figs. 1–4) are not part of the dataset deposit.</w:t>
+        <w:t xml:space="preserve">The dataset described in this article is available on figshare under DOI </w:t>
+      </w:r>
+      <w:hyperlink r:id="rId9">
+        <w:r>
+          <w:rPr>
+            <w:color w:val="0563C1"/>
+            <w:u w:val="single"/>
+            <w:sz w:val="22"/>
+            <w:rFonts w:ascii="Times New Roman" w:hAnsi="Times New Roman" w:eastAsia="Times New Roman"/>
+          </w:rPr>
+          <w:t>https://doi.org/10.6084/m9.figshare.33201579</w:t>
+        </w:r>
+      </w:hyperlink>
+      <w:r>
+        <w:rPr>
+          <w:rFonts w:ascii="Times New Roman" w:hAnsi="Times New Roman" w:eastAsia="Times New Roman"/>
+          <w:b w:val="0"/>
+          <w:i w:val="0"/>
+          <w:sz w:val="22"/>
+        </w:rPr>
+        <w:t xml:space="preserve"> [8]. Repository contents include the files listed in Table 1 (CSV/JSON tables and README.md). Manuscript figures (Figs. 1–4) are not part of the dataset deposit.</w:t>
       </w:r>
     </w:p>
     <w:p>
@@ -5821,7 +5872,36 @@
           <w:i w:val="0"/>
           <w:sz w:val="22"/>
         </w:rPr>
-        <w:t>Supporting code for this data article is available in the project repository at https://gitee.com/sacourse/yeast.git. The repository provides: (i) scripts for packaging the digitized batch tables into the released CSV layout; (ii) scripts for regenerating the manuscript figures under paper/figures/; and (iii) a usage example that trains lightweight sequence models (BiLSTM or 1D-CNN) to predict sugar feed rate under leave-one-batch-out validation, together with example metrics. Installation dependencies are listed in requirements.txt. The code is intended to demonstrate dataset usability and to support reproduction of the figures and baseline prediction results reported in this article.</w:t>
+        <w:t xml:space="preserve">Supporting code for this data article is available in the project repository at </w:t>
+      </w:r>
+      <w:hyperlink r:id="rId14">
+        <w:r>
+          <w:rPr>
+            <w:color w:val="0563C1"/>
+            <w:u w:val="single"/>
+            <w:sz w:val="22"/>
+            <w:rFonts w:ascii="Times New Roman" w:hAnsi="Times New Roman" w:eastAsia="Times New Roman"/>
+          </w:rPr>
+          <w:t>https://gitee.com/sacourse/yeast.git</w:t>
+        </w:r>
+      </w:hyperlink>
+      <w:r>
+        <w:rPr>
+          <w:rFonts w:ascii="Times New Roman" w:hAnsi="Times New Roman" w:eastAsia="Times New Roman"/>
+          <w:b w:val="0"/>
+          <w:i w:val="0"/>
+          <w:sz w:val="22"/>
+        </w:rPr>
+        <w:t>.</w:t>
+      </w:r>
+      <w:r>
+        <w:rPr>
+          <w:rFonts w:ascii="Times New Roman" w:hAnsi="Times New Roman" w:eastAsia="Times New Roman"/>
+          <w:b w:val="0"/>
+          <w:i w:val="0"/>
+          <w:sz w:val="22"/>
+        </w:rPr>
+        <w:t xml:space="preserve"> The repository provides: (i) scripts for packaging the digitized batch tables into the released CSV layout; (ii) scripts for regenerating the manuscript figures under paper/figures/; and (iii) a usage example that trains lightweight sequence models (BiLSTM or 1D-CNN) to predict sugar feed rate under leave-one-batch-out validation, together with example metrics. Installation dependencies are listed in requirements.txt. The code is intended to demonstrate dataset usability and to support reproduction of the figures and baseline prediction results reported in this article.</w:t>
       </w:r>
     </w:p>
     <w:p>
@@ -5900,7 +5980,27 @@
           <w:i w:val="0"/>
           <w:sz w:val="22"/>
         </w:rPr>
-        <w:t xml:space="preserve"> is controlled by its limited respiratory capacity: formulation and verification of a hypothesis, Biotechnol. Bioeng. 28 (1986) 927–937. https://doi.org/10.1002/bit.260280620.</w:t>
+        <w:t xml:space="preserve"> is controlled by its limited respiratory capacity: formulation and verification of a hypothesis, Biotechnol. Bioeng. 28 (1986) 927–937. </w:t>
+      </w:r>
+      <w:hyperlink r:id="rId15">
+        <w:r>
+          <w:rPr>
+            <w:color w:val="0563C1"/>
+            <w:u w:val="single"/>
+            <w:sz w:val="22"/>
+            <w:rFonts w:ascii="Times New Roman" w:hAnsi="Times New Roman" w:eastAsia="Times New Roman"/>
+          </w:rPr>
+          <w:t>https://doi.org/10.1002/bit.260280620</w:t>
+        </w:r>
+      </w:hyperlink>
+      <w:r>
+        <w:rPr>
+          <w:rFonts w:ascii="Times New Roman" w:hAnsi="Times New Roman" w:eastAsia="Times New Roman"/>
+          <w:b w:val="0"/>
+          <w:i w:val="0"/>
+          <w:sz w:val="22"/>
+        </w:rPr>
+        <w:t>.</w:t>
       </w:r>
     </w:p>
     <w:p>
@@ -5940,7 +6040,27 @@
           <w:i w:val="0"/>
           <w:sz w:val="22"/>
         </w:rPr>
-        <w:t>[4] P. Kadlec, B. Gabrys, S. Strandt, Data-driven soft sensors in the process industry, Comput. Chem. Eng. 33 (2009) 795–814. https://doi.org/10.1016/j.compchemeng.2008.12.012.</w:t>
+        <w:t xml:space="preserve">[4] P. Kadlec, B. Gabrys, S. Strandt, Data-driven soft sensors in the process industry, Comput. Chem. Eng. 33 (2009) 795–814. </w:t>
+      </w:r>
+      <w:hyperlink r:id="rId16">
+        <w:r>
+          <w:rPr>
+            <w:color w:val="0563C1"/>
+            <w:u w:val="single"/>
+            <w:sz w:val="22"/>
+            <w:rFonts w:ascii="Times New Roman" w:hAnsi="Times New Roman" w:eastAsia="Times New Roman"/>
+          </w:rPr>
+          <w:t>https://doi.org/10.1016/j.compchemeng.2008.12.012</w:t>
+        </w:r>
+      </w:hyperlink>
+      <w:r>
+        <w:rPr>
+          <w:rFonts w:ascii="Times New Roman" w:hAnsi="Times New Roman" w:eastAsia="Times New Roman"/>
+          <w:b w:val="0"/>
+          <w:i w:val="0"/>
+          <w:sz w:val="22"/>
+        </w:rPr>
+        <w:t>.</w:t>
       </w:r>
     </w:p>
     <w:p>
@@ -5951,7 +6071,27 @@
           <w:i w:val="0"/>
           <w:sz w:val="22"/>
         </w:rPr>
-        <w:t>[5] Z. Ge, Review on data-driven modeling and monitoring for plant-wide industrial processes, Chemometrics and Intelligent Laboratory Systems 171 (2017) 16–25. https://doi.org/10.1016/j.chemolab.2017.09.021.</w:t>
+        <w:t xml:space="preserve">[5] Z. Ge, Review on data-driven modeling and monitoring for plant-wide industrial processes, Chemometrics and Intelligent Laboratory Systems 171 (2017) 16–25. </w:t>
+      </w:r>
+      <w:hyperlink r:id="rId17">
+        <w:r>
+          <w:rPr>
+            <w:color w:val="0563C1"/>
+            <w:u w:val="single"/>
+            <w:sz w:val="22"/>
+            <w:rFonts w:ascii="Times New Roman" w:hAnsi="Times New Roman" w:eastAsia="Times New Roman"/>
+          </w:rPr>
+          <w:t>https://doi.org/10.1016/j.chemolab.2017.09.021</w:t>
+        </w:r>
+      </w:hyperlink>
+      <w:r>
+        <w:rPr>
+          <w:rFonts w:ascii="Times New Roman" w:hAnsi="Times New Roman" w:eastAsia="Times New Roman"/>
+          <w:b w:val="0"/>
+          <w:i w:val="0"/>
+          <w:sz w:val="22"/>
+        </w:rPr>
+        <w:t>.</w:t>
       </w:r>
     </w:p>
     <w:p>
@@ -5962,7 +6102,27 @@
           <w:i w:val="0"/>
           <w:sz w:val="22"/>
         </w:rPr>
-        <w:t>[6] S.J. Pan, Q. Yang, A survey on transfer learning, IEEE Trans. Knowl. Data Eng. 22 (2010) 1345–1359. https://doi.org/10.1109/TKDE.2009.35.</w:t>
+        <w:t xml:space="preserve">[6] S.J. Pan, Q. Yang, A survey on transfer learning, IEEE Trans. Knowl. Data Eng. 22 (2010) 1345–1359. </w:t>
+      </w:r>
+      <w:hyperlink r:id="rId18">
+        <w:r>
+          <w:rPr>
+            <w:color w:val="0563C1"/>
+            <w:u w:val="single"/>
+            <w:sz w:val="22"/>
+            <w:rFonts w:ascii="Times New Roman" w:hAnsi="Times New Roman" w:eastAsia="Times New Roman"/>
+          </w:rPr>
+          <w:t>https://doi.org/10.1109/TKDE.2009.35</w:t>
+        </w:r>
+      </w:hyperlink>
+      <w:r>
+        <w:rPr>
+          <w:rFonts w:ascii="Times New Roman" w:hAnsi="Times New Roman" w:eastAsia="Times New Roman"/>
+          <w:b w:val="0"/>
+          <w:i w:val="0"/>
+          <w:sz w:val="22"/>
+        </w:rPr>
+        <w:t>.</w:t>
       </w:r>
     </w:p>
     <w:p>
@@ -5973,7 +6133,27 @@
           <w:i w:val="0"/>
           <w:sz w:val="22"/>
         </w:rPr>
-        <w:t>[7] Z. Ge, Z. Song, S. X. Ding, B. Huang, Data mining and analytics in the process industry: the role of machine learning, IEEE Access 5 (2017) 20590–20616. https://doi.org/10.1109/ACCESS.2017.2756872.</w:t>
+        <w:t xml:space="preserve">[7] Z. Ge, Z. Song, S. X. Ding, B. Huang, Data mining and analytics in the process industry: the role of machine learning, IEEE Access 5 (2017) 20590–20616. </w:t>
+      </w:r>
+      <w:hyperlink r:id="rId19">
+        <w:r>
+          <w:rPr>
+            <w:color w:val="0563C1"/>
+            <w:u w:val="single"/>
+            <w:sz w:val="22"/>
+            <w:rFonts w:ascii="Times New Roman" w:hAnsi="Times New Roman" w:eastAsia="Times New Roman"/>
+          </w:rPr>
+          <w:t>https://doi.org/10.1109/ACCESS.2017.2756872</w:t>
+        </w:r>
+      </w:hyperlink>
+      <w:r>
+        <w:rPr>
+          <w:rFonts w:ascii="Times New Roman" w:hAnsi="Times New Roman" w:eastAsia="Times New Roman"/>
+          <w:b w:val="0"/>
+          <w:i w:val="0"/>
+          <w:sz w:val="22"/>
+        </w:rPr>
+        <w:t>.</w:t>
       </w:r>
     </w:p>
     <w:p>
@@ -5984,7 +6164,27 @@
           <w:i w:val="0"/>
           <w:sz w:val="22"/>
         </w:rPr>
-        <w:t>[8] C. Ren, L. Zhao, L. Kang, Q. Guo, An industrial yeast fed-batch fermentation dataset for nutrient feed-rate prediction, figshare (2026). https://doi.org/10.6084/m9.figshare.33201579.</w:t>
+        <w:t xml:space="preserve">[8] C. Ren, L. Zhao, L. Kang, Q. Guo, An industrial yeast fed-batch fermentation dataset for nutrient feed-rate prediction, figshare (2026). </w:t>
+      </w:r>
+      <w:hyperlink r:id="rId9">
+        <w:r>
+          <w:rPr>
+            <w:color w:val="0563C1"/>
+            <w:u w:val="single"/>
+            <w:sz w:val="22"/>
+            <w:rFonts w:ascii="Times New Roman" w:hAnsi="Times New Roman" w:eastAsia="Times New Roman"/>
+          </w:rPr>
+          <w:t>https://doi.org/10.6084/m9.figshare.33201579</w:t>
+        </w:r>
+      </w:hyperlink>
+      <w:r>
+        <w:rPr>
+          <w:rFonts w:ascii="Times New Roman" w:hAnsi="Times New Roman" w:eastAsia="Times New Roman"/>
+          <w:b w:val="0"/>
+          <w:i w:val="0"/>
+          <w:sz w:val="22"/>
+        </w:rPr>
+        <w:t>.</w:t>
       </w:r>
     </w:p>
     <w:sectPr>

</xml_diff>